<commit_message>
added 24 transmitters in parallel
</commit_message>
<xml_diff>
--- a/IR research.docx
+++ b/IR research.docx
@@ -20,18 +20,10 @@
     </w:p>
     <w:p>
       <w:r>
-        <w:t xml:space="preserve">While </w:t>
-      </w:r>
-      <w:proofErr w:type="gramStart"/>
-      <w:r>
-        <w:t xml:space="preserve">creating </w:t>
-      </w:r>
-      <w:r>
-        <w:t xml:space="preserve"> the</w:t>
-      </w:r>
-      <w:proofErr w:type="gramEnd"/>
-      <w:r>
-        <w:t xml:space="preserve"> Nec parallel transmitter I have encountered with the interference problem of 2 transmitters when they stand near to each other, so I need to develop some protection to them, or something like guiding tube</w:t>
+        <w:t xml:space="preserve">While creating </w:t>
+      </w:r>
+      <w:r>
+        <w:t xml:space="preserve"> the Nec parallel transmitter I have encountered with the interference problem of 2 transmitters when they stand near to each other, so I need to develop some protection to them, or something like guiding tube</w:t>
       </w:r>
     </w:p>
     <w:p>
@@ -39,23 +31,7 @@
         <w:t>My signal is Nec standard and has a carrier frequency of 38 KHZ,</w:t>
       </w:r>
       <w:r>
-        <w:t xml:space="preserve"> and the </w:t>
-      </w:r>
-      <w:proofErr w:type="gramStart"/>
-      <w:r>
-        <w:t>wavelength(</w:t>
-      </w:r>
-      <w:proofErr w:type="gramEnd"/>
-      <w:r>
-        <w:t>of a transmission LED) is 940nm (3</w:t>
-      </w:r>
-      <w:proofErr w:type="gramStart"/>
-      <w:r>
-        <w:t>)</w:t>
-      </w:r>
-      <w:proofErr w:type="gramEnd"/>
-      <w:r>
-        <w:t xml:space="preserve"> so it defined as NIR region.</w:t>
+        <w:t xml:space="preserve"> and the wavelength(of a transmission LED) is 940nm (3) so it defined as NIR region.</w:t>
       </w:r>
     </w:p>
     <w:p>
@@ -113,19 +89,14 @@
     </w:p>
     <w:p>
       <w:r>
-        <w:t xml:space="preserve">And the photo of </w:t>
-      </w:r>
-      <w:proofErr w:type="gramStart"/>
-      <w:r>
-        <w:t>regions(</w:t>
-      </w:r>
-      <w:proofErr w:type="gramEnd"/>
-      <w:r>
-        <w:t>2):</w:t>
+        <w:t>And the photo of regions(2):</w:t>
       </w:r>
     </w:p>
     <w:p>
       <w:r>
+        <w:rPr>
+          <w:noProof/>
+        </w:rPr>
         <w:drawing>
           <wp:inline distT="0" distB="0" distL="0" distR="0" wp14:anchorId="48E649E3" wp14:editId="615CBEE5">
             <wp:extent cx="5731510" cy="2981325"/>
@@ -180,6 +151,21 @@
         <w:t xml:space="preserve">I used the copper metal and it works properly for insulating. </w:t>
       </w:r>
     </w:p>
+    <w:p>
+      <w:r>
+        <w:lastRenderedPageBreak/>
+        <w:t xml:space="preserve">I was asked to add more parallel transmitters, and the maximum amount I can use is 8 from PMODA 8 from PMOD B and 20 from Arduino, so </w:t>
+      </w:r>
+      <w:r>
+        <w:t>in</w:t>
+      </w:r>
+      <w:r>
+        <w:t xml:space="preserve"> total we can use 36 pins for transmission.</w:t>
+      </w:r>
+      <w:r>
+        <w:t>I will  use 24, all Arduino pins and 4 PmodA pins</w:t>
+      </w:r>
+    </w:p>
     <w:p/>
     <w:p/>
     <w:p/>
@@ -238,19 +224,7 @@
           <w:rPr>
             <w:rStyle w:val="Hyperlink"/>
           </w:rPr>
-          <w:t>https://</w:t>
-        </w:r>
-        <w:r>
-          <w:rPr>
-            <w:rStyle w:val="Hyperlink"/>
-          </w:rPr>
-          <w:t>w</w:t>
-        </w:r>
-        <w:r>
-          <w:rPr>
-            <w:rStyle w:val="Hyperlink"/>
-          </w:rPr>
-          <w:t>ww.edmundoptics.com/knowledge-center/application-notes/optics/the-correct-material-for-infrared-applications/?srsltid=AfmBOorvoiugnx3GvH8vECmKRzjDPlJmNhuAdGI3hzvmdaas96Uk1zmx</w:t>
+          <w:t>https://www.edmundoptics.com/knowledge-center/application-notes/optics/the-correct-material-for-infrared-applications/?srsltid=AfmBOorvoiugnx3GvH8vECmKRzjDPlJmNhuAdGI3hzvmdaas96Uk1zmx</w:t>
         </w:r>
       </w:hyperlink>
     </w:p>
@@ -280,7 +254,6 @@
         </w:numPr>
       </w:pPr>
       <w:r>
-        <w:lastRenderedPageBreak/>
         <w:t>https://carbodiimide.com/near-infrared-absorbing-materials-and-their-applications/</w:t>
       </w:r>
     </w:p>

</xml_diff>

<commit_message>
added different carrier frequency
</commit_message>
<xml_diff>
--- a/IR research.docx
+++ b/IR research.docx
@@ -164,6 +164,37 @@
       </w:r>
       <w:r>
         <w:t>I will  use 24, all Arduino pins and 4 PmodA pins</w:t>
+      </w:r>
+      <w:r>
+        <w:t>.</w:t>
+      </w:r>
+    </w:p>
+    <w:p>
+      <w:r>
+        <w:t xml:space="preserve">I have implemented this, hovewer physical barrier is not possible, so that we have to implement other options for IR transmission. The one I would like to implement is the carrier transferring  from 38KHZ to </w:t>
+      </w:r>
+      <w:r>
+        <w:t>8</w:t>
+      </w:r>
+      <w:r>
+        <w:t>4</w:t>
+      </w:r>
+      <w:r>
+        <w:t>KHZ</w:t>
+      </w:r>
+      <w:r>
+        <w:t>, with the step of 2KHZ</w:t>
+      </w:r>
+    </w:p>
+    <w:p>
+      <w:r>
+        <w:t>Other way is very complicated process:</w:t>
+      </w:r>
+      <w:r>
+        <w:t xml:space="preserve"> </w:t>
+      </w:r>
+      <w:r>
+        <w:t>Channel Reuse Strategies for Indoor Infrared Wireless Communications</w:t>
       </w:r>
     </w:p>
     <w:p/>
@@ -253,8 +284,25 @@
           <w:numId w:val="1"/>
         </w:numPr>
       </w:pPr>
-      <w:r>
-        <w:t>https://carbodiimide.com/near-infrared-absorbing-materials-and-their-applications/</w:t>
+      <w:hyperlink r:id="rId10" w:history="1">
+        <w:r>
+          <w:rPr>
+            <w:rStyle w:val="Hyperlink"/>
+          </w:rPr>
+          <w:t>https://carbodiimide.com/near-infrared-absorbing-materials-and-their-applications/</w:t>
+        </w:r>
+      </w:hyperlink>
+    </w:p>
+    <w:p>
+      <w:pPr>
+        <w:pStyle w:val="ListParagraph"/>
+        <w:numPr>
+          <w:ilvl w:val="0"/>
+          <w:numId w:val="1"/>
+        </w:numPr>
+      </w:pPr>
+      <w:r>
+        <w:t>https://ieeexplore.ieee.org/stamp/stamp.jsp?tp=&amp;arnumber=591910</w:t>
       </w:r>
     </w:p>
     <w:p/>
@@ -968,7 +1016,6 @@
   <w:style w:type="character" w:default="1" w:styleId="DefaultParagraphFont">
     <w:name w:val="Default Paragraph Font"/>
     <w:uiPriority w:val="1"/>
-    <w:semiHidden/>
     <w:unhideWhenUsed/>
   </w:style>
   <w:style w:type="table" w:default="1" w:styleId="TableNormal">

</xml_diff>